<commit_message>
Replace CV skills section with the user's wording
Rebuilds the PDF and DOCX and notes the change in the report.

Co-Authored-By: Claude Opus 5.5 <noreply@anthropic.com>
Claude-Session: https://claude.ai/code/session_01MrkGmJfhWccHdibctUDmdw
</commit_message>
<xml_diff>
--- a/cv/Md_Shamiul_Islam_Riyad_Software_Engineer_Intern_CV.docx
+++ b/cv/Md_Shamiul_Islam_Riyad_Software_Engineer_Intern_CV.docx
@@ -125,22 +125,7 @@
         <w:t>Languages:</w:t>
       </w:r>
       <w:r>
-        <w:t xml:space="preserve"> C#, C++, SQL, JavaScript, Java</w:t>
-      </w:r>
-    </w:p>
-    <w:p>
-      <w:pPr>
-        <w:spacing w:before="0" w:after="20" w:line="240" w:lineRule="auto"/>
-        <w:ind w:left="198" w:hanging="198"/>
-      </w:pPr>
-      <w:r>
-        <w:rPr>
-          <w:b/>
-        </w:rPr>
-        <w:t>Fundamentals:</w:t>
-      </w:r>
-      <w:r>
-        <w:t xml:space="preserve"> Data structures and algorithms, OOP (interfaces, dependency injection), layered architecture</w:t>
+        <w:t xml:space="preserve"> C#, C++, SQL</w:t>
       </w:r>
     </w:p>
     <w:p>
@@ -155,7 +140,7 @@
         <w:t>Backend:</w:t>
       </w:r>
       <w:r>
-        <w:t xml:space="preserve"> ASP.NET Core Web API (.NET 8/10), EF Core, REST APIs, JWT, role-based authorization, FluentValidation, SignalR, background services</w:t>
+        <w:t xml:space="preserve"> ASP.NET Core Web API, Entity Framework Core, REST API Design</w:t>
       </w:r>
     </w:p>
     <w:p>
@@ -170,7 +155,22 @@
         <w:t>Databases:</w:t>
       </w:r>
       <w:r>
-        <w:t xml:space="preserve"> PostgreSQL, schema design (keys, indexes, delete rules), EF Core code-first migrations, transactions</w:t>
+        <w:t xml:space="preserve"> PostgreSQL, Relational Database Design</w:t>
+      </w:r>
+    </w:p>
+    <w:p>
+      <w:pPr>
+        <w:spacing w:before="0" w:after="20" w:line="240" w:lineRule="auto"/>
+        <w:ind w:left="198" w:hanging="198"/>
+      </w:pPr>
+      <w:r>
+        <w:rPr>
+          <w:b/>
+        </w:rPr>
+        <w:t>Engineering:</w:t>
+      </w:r>
+      <w:r>
+        <w:t xml:space="preserve"> OOP, Dependency Injection, Authentication &amp; Authorization, Git</w:t>
       </w:r>
     </w:p>
     <w:p>
@@ -185,22 +185,7 @@
         <w:t>Frontend:</w:t>
       </w:r>
       <w:r>
-        <w:t xml:space="preserve"> React, Axios, Vite</w:t>
-      </w:r>
-    </w:p>
-    <w:p>
-      <w:pPr>
-        <w:spacing w:before="0" w:after="20" w:line="240" w:lineRule="auto"/>
-        <w:ind w:left="198" w:hanging="198"/>
-      </w:pPr>
-      <w:r>
-        <w:rPr>
-          <w:b/>
-        </w:rPr>
-        <w:t>Testing and tools:</w:t>
-      </w:r>
-      <w:r>
-        <w:t xml:space="preserve"> xUnit, EF Core InMemory, regression-check programs, Swagger, .http files, Git, GitHub</w:t>
+        <w:t xml:space="preserve"> React.js — project experience; JavaScript fundamentals currently developing</w:t>
       </w:r>
     </w:p>
     <w:p>

</xml_diff>